<commit_message>
:bug: Reinterpret YG public body field as internal contact department.
Make program area/branch conditional on presence of branch or unit.
</commit_message>
<xml_diff>
--- a/api/src/templates/information-sharing-agreements/confidentiality-receipt-template.docx
+++ b/api/src/templates/information-sharing-agreements/confidentiality-receipt-template.docx
@@ -184,14 +184,21 @@
           <w:b w:val="1"/>
           <w:bCs w:val="1"/>
         </w:rPr>
-        <w:t>information_sharing_agreement.</w:t>
+        <w:t>internal_group_contact</w:t>
       </w:r>
       <w:r>
         <w:rPr>
           <w:b w:val="1"/>
           <w:bCs w:val="1"/>
         </w:rPr>
-        <w:t>department_branch_unit_hierarchy</w:t>
+        <w:t>.</w:t>
+      </w:r>
+      <w:r>
+        <w:rPr>
+          <w:b w:val="1"/>
+          <w:bCs w:val="1"/>
+        </w:rPr>
+        <w:t>department</w:t>
       </w:r>
       <w:r>
         <w:rPr>
@@ -399,6 +406,22 @@
               <w:rPr/>
               <w:t>}</w:t>
             </w:r>
+            <w:r>
+              <w:rPr/>
+              <w:t>{#</w:t>
+            </w:r>
+            <w:r>
+              <w:rPr/>
+              <w:t>h</w:t>
+            </w:r>
+            <w:r>
+              <w:rPr/>
+              <w:t>as_internal_group_contact_branch_or_unit</w:t>
+            </w:r>
+            <w:r>
+              <w:rPr/>
+              <w:t>}</w:t>
+            </w:r>
           </w:p>
           <w:p>
             <w:pPr>
@@ -415,7 +438,27 @@
             </w:r>
             <w:r>
               <w:rPr/>
-              <w:t>internal_group_contact.branch</w:t>
+              <w:t>internal_group_contact</w:t>
+            </w:r>
+            <w:r>
+              <w:rPr/>
+              <w:t>.</w:t>
+            </w:r>
+            <w:r>
+              <w:rPr/>
+              <w:t>branch_unit_hierarchy</w:t>
+            </w:r>
+            <w:r>
+              <w:rPr/>
+              <w:t>}</w:t>
+            </w:r>
+            <w:r>
+              <w:rPr/>
+              <w:t>{/</w:t>
+            </w:r>
+            <w:r>
+              <w:rPr/>
+              <w:t>has_internal_group_contact_branch_or_unit</w:t>
             </w:r>
             <w:r>
               <w:rPr/>
@@ -423,21 +466,16 @@
             </w:r>
           </w:p>
           <w:p>
+            <w:pPr>
+              <w:pStyle w:val="Normal"/>
+            </w:pPr>
             <w:r>
               <w:rPr/>
               <w:t>{</w:t>
             </w:r>
             <w:r>
               <w:rPr/>
-              <w:t>information_sharing_agreement</w:t>
-            </w:r>
-            <w:r>
-              <w:rPr/>
-              <w:t>.</w:t>
-            </w:r>
-            <w:r>
-              <w:rPr/>
-              <w:t>department_branch_unit_hierarchy</w:t>
+              <w:t>internal_group_contact.department</w:t>
             </w:r>
             <w:r>
               <w:rPr/>

</xml_diff>